<commit_message>
Feature1 branch-da postman bug faylında dəyişiklik
</commit_message>
<xml_diff>
--- a/postman bug.docx
+++ b/postman bug.docx
@@ -443,8 +443,18 @@
           <w:sz w:val="20"/>
           <w:szCs w:val="20"/>
         </w:rPr>
-        <w:t>https://test-api.qrcodelama.com/v1/users/register</w:t>
-      </w:r>
+        <w:t>https://test-api.</w:t>
+      </w:r>
+      <w:r>
+        <w:rPr>
+          <w:rFonts w:ascii="Courier New" w:eastAsia="Times New Roman" w:hAnsi="Courier New" w:cs="Courier New"/>
+          <w:sz w:val="20"/>
+          <w:szCs w:val="20"/>
+        </w:rPr>
+        <w:t>qrcodelama.com/v1/users/registe</w:t>
+      </w:r>
+      <w:bookmarkStart w:id="0" w:name="_GoBack"/>
+      <w:bookmarkEnd w:id="0"/>
     </w:p>
     <w:p>
       <w:pPr>
@@ -1196,6 +1206,16 @@
         </w:rPr>
         <w:t>": "eyJhbGciOiJIUzI1NiIsInR5cCI..."</w:t>
       </w:r>
+      <w:proofErr w:type="spellStart"/>
+      <w:r>
+        <w:rPr>
+          <w:rFonts w:ascii="Courier New" w:eastAsia="Times New Roman" w:hAnsi="Courier New" w:cs="Courier New"/>
+          <w:sz w:val="20"/>
+          <w:szCs w:val="20"/>
+        </w:rPr>
+        <w:t>bbbbb</w:t>
+      </w:r>
+      <w:proofErr w:type="spellEnd"/>
     </w:p>
     <w:p>
       <w:pPr>
@@ -1437,8 +1457,6 @@
           </wp:inline>
         </w:drawing>
       </w:r>
-      <w:bookmarkStart w:id="0" w:name="_GoBack"/>
-      <w:bookmarkEnd w:id="0"/>
     </w:p>
     <w:sectPr>
       <w:pgSz w:w="12240" w:h="15840"/>

</xml_diff>